<commit_message>
a lot of work done
</commit_message>
<xml_diff>
--- a/Project Proposal - Bella's Bistro.docx
+++ b/Project Proposal - Bella's Bistro.docx
@@ -158,7 +158,6 @@
             <w:dataBinding w:prefixMappings="xmlns:ns0='http://purl.org/dc/elements/1.1/' xmlns:ns1='http://schemas.openxmlformats.org/package/2006/metadata/core-properties' " w:xpath="/ns1:coreProperties[1]/ns0:subject[1]" w:storeItemID="{6C3C8BC8-F283-45AE-878A-BAB7291924A1}"/>
             <w:text/>
           </w:sdtPr>
-          <w:sdtEndPr/>
           <w:sdtContent>
             <w:p>
               <w:pPr>
@@ -6726,6 +6725,9 @@
       <w:r>
         <w:t>Scope creep</w:t>
       </w:r>
+      <w:r>
+        <w:t xml:space="preserve"> due to unclear project requirements </w:t>
+      </w:r>
     </w:p>
     <w:p>
       <w:pPr>
@@ -6736,7 +6738,7 @@
         </w:numPr>
       </w:pPr>
       <w:r>
-        <w:t>Schedule delays</w:t>
+        <w:t>Key Team member unavailable</w:t>
       </w:r>
     </w:p>
     <w:p>
@@ -6748,7 +6750,7 @@
         </w:numPr>
       </w:pPr>
       <w:r>
-        <w:t>Quality issues</w:t>
+        <w:t xml:space="preserve">Insufficient testing leading to undetected bugs at launch </w:t>
       </w:r>
     </w:p>
     <w:p>
@@ -6760,7 +6762,7 @@
         </w:numPr>
       </w:pPr>
       <w:r>
-        <w:t>Technical failure</w:t>
+        <w:t>Unrealistic project milestones and deadlines</w:t>
       </w:r>
     </w:p>
     <w:p>
@@ -6781,14 +6783,11 @@
         <w:pStyle w:val="ListParagraph"/>
         <w:numPr>
           <w:ilvl w:val="0"/>
-          <w:numId w:val="21"/>
+          <w:numId w:val="29"/>
         </w:numPr>
       </w:pPr>
       <w:r>
-        <w:t>DD</w:t>
-      </w:r>
-      <w:r>
-        <w:t>OS Attack</w:t>
+        <w:t>System integration failures between third-party APIs</w:t>
       </w:r>
     </w:p>
     <w:p>
@@ -6796,11 +6795,16 @@
         <w:pStyle w:val="ListParagraph"/>
         <w:numPr>
           <w:ilvl w:val="0"/>
-          <w:numId w:val="21"/>
+          <w:numId w:val="29"/>
         </w:numPr>
       </w:pPr>
-      <w:r>
-        <w:t>Broken functionality after updates</w:t>
+      <w:proofErr w:type="spellStart"/>
+      <w:r>
+        <w:t>Scalabiity</w:t>
+      </w:r>
+      <w:proofErr w:type="spellEnd"/>
+      <w:r>
+        <w:t xml:space="preserve"> limitations under peak user demand </w:t>
       </w:r>
     </w:p>
     <w:p>
@@ -6808,11 +6812,11 @@
         <w:pStyle w:val="ListParagraph"/>
         <w:numPr>
           <w:ilvl w:val="0"/>
-          <w:numId w:val="21"/>
+          <w:numId w:val="29"/>
         </w:numPr>
       </w:pPr>
       <w:r>
-        <w:t>Data loss or corruption</w:t>
+        <w:t xml:space="preserve">Inadequate data backup and disaster recovery plans </w:t>
       </w:r>
     </w:p>
     <w:p>
@@ -6820,38 +6824,11 @@
         <w:pStyle w:val="ListParagraph"/>
         <w:numPr>
           <w:ilvl w:val="0"/>
-          <w:numId w:val="21"/>
+          <w:numId w:val="29"/>
         </w:numPr>
       </w:pPr>
       <w:r>
-        <w:t>Scalability limitation under</w:t>
-      </w:r>
-      <w:r>
-        <w:t xml:space="preserve"> high traffic</w:t>
-      </w:r>
-    </w:p>
-    <w:p>
-      <w:pPr>
-        <w:pStyle w:val="ListParagraph"/>
-        <w:numPr>
-          <w:ilvl w:val="0"/>
-          <w:numId w:val="21"/>
-        </w:numPr>
-      </w:pPr>
-      <w:r>
-        <w:t>Third party service failure</w:t>
-      </w:r>
-    </w:p>
-    <w:p>
-      <w:pPr>
-        <w:pStyle w:val="ListParagraph"/>
-        <w:numPr>
-          <w:ilvl w:val="0"/>
-          <w:numId w:val="21"/>
-        </w:numPr>
-      </w:pPr>
-      <w:r>
-        <w:t>Server outages</w:t>
+        <w:t xml:space="preserve">Outdated software dependencies causing vulnerabilities </w:t>
       </w:r>
     </w:p>
     <w:p>
@@ -6939,7 +6916,6 @@
         </w:numPr>
       </w:pPr>
       <w:r>
-        <w:lastRenderedPageBreak/>
         <w:t>Red Coloured Cells = High priority risks</w:t>
       </w:r>
     </w:p>
@@ -8007,11 +7983,7 @@
               <w:t xml:space="preserve">Adding </w:t>
             </w:r>
             <w:r>
-              <w:t xml:space="preserve">responses to the negative reviews to clear up any misunderstanding or to show </w:t>
-            </w:r>
-            <w:r>
-              <w:lastRenderedPageBreak/>
-              <w:t xml:space="preserve">that actions have been taken </w:t>
+              <w:t xml:space="preserve">responses to the negative reviews to clear up any misunderstanding or to show that actions have been taken </w:t>
             </w:r>
             <w:r>
               <w:t>after</w:t>
@@ -8404,11 +8376,7 @@
         <w:t xml:space="preserve"> be large, plenty of spacing between elements</w:t>
       </w:r>
       <w:r>
-        <w:t xml:space="preserve"> and </w:t>
-      </w:r>
-      <w:r>
-        <w:lastRenderedPageBreak/>
-        <w:t>large text will be used.</w:t>
+        <w:t xml:space="preserve"> and large text will be used.</w:t>
       </w:r>
       <w:r>
         <w:t xml:space="preserve"> As for the overall UI complexity it will be </w:t>
@@ -10098,6 +10066,92 @@
     </w:lvl>
   </w:abstractNum>
   <w:abstractNum w:abstractNumId="15" w15:restartNumberingAfterBreak="0">
+    <w:nsid w:val="394124E4"/>
+    <w:multiLevelType w:val="hybridMultilevel"/>
+    <w:tmpl w:val="F32A3EC0"/>
+    <w:lvl w:ilvl="0" w:tplc="0809000F">
+      <w:start w:val="1"/>
+      <w:numFmt w:val="decimal"/>
+      <w:lvlText w:val="%1."/>
+      <w:lvlJc w:val="left"/>
+      <w:pPr>
+        <w:ind w:left="720" w:hanging="360"/>
+      </w:pPr>
+    </w:lvl>
+    <w:lvl w:ilvl="1" w:tplc="08090019" w:tentative="1">
+      <w:start w:val="1"/>
+      <w:numFmt w:val="lowerLetter"/>
+      <w:lvlText w:val="%2."/>
+      <w:lvlJc w:val="left"/>
+      <w:pPr>
+        <w:ind w:left="1440" w:hanging="360"/>
+      </w:pPr>
+    </w:lvl>
+    <w:lvl w:ilvl="2" w:tplc="0809001B" w:tentative="1">
+      <w:start w:val="1"/>
+      <w:numFmt w:val="lowerRoman"/>
+      <w:lvlText w:val="%3."/>
+      <w:lvlJc w:val="right"/>
+      <w:pPr>
+        <w:ind w:left="2160" w:hanging="180"/>
+      </w:pPr>
+    </w:lvl>
+    <w:lvl w:ilvl="3" w:tplc="0809000F" w:tentative="1">
+      <w:start w:val="1"/>
+      <w:numFmt w:val="decimal"/>
+      <w:lvlText w:val="%4."/>
+      <w:lvlJc w:val="left"/>
+      <w:pPr>
+        <w:ind w:left="2880" w:hanging="360"/>
+      </w:pPr>
+    </w:lvl>
+    <w:lvl w:ilvl="4" w:tplc="08090019" w:tentative="1">
+      <w:start w:val="1"/>
+      <w:numFmt w:val="lowerLetter"/>
+      <w:lvlText w:val="%5."/>
+      <w:lvlJc w:val="left"/>
+      <w:pPr>
+        <w:ind w:left="3600" w:hanging="360"/>
+      </w:pPr>
+    </w:lvl>
+    <w:lvl w:ilvl="5" w:tplc="0809001B" w:tentative="1">
+      <w:start w:val="1"/>
+      <w:numFmt w:val="lowerRoman"/>
+      <w:lvlText w:val="%6."/>
+      <w:lvlJc w:val="right"/>
+      <w:pPr>
+        <w:ind w:left="4320" w:hanging="180"/>
+      </w:pPr>
+    </w:lvl>
+    <w:lvl w:ilvl="6" w:tplc="0809000F" w:tentative="1">
+      <w:start w:val="1"/>
+      <w:numFmt w:val="decimal"/>
+      <w:lvlText w:val="%7."/>
+      <w:lvlJc w:val="left"/>
+      <w:pPr>
+        <w:ind w:left="5040" w:hanging="360"/>
+      </w:pPr>
+    </w:lvl>
+    <w:lvl w:ilvl="7" w:tplc="08090019" w:tentative="1">
+      <w:start w:val="1"/>
+      <w:numFmt w:val="lowerLetter"/>
+      <w:lvlText w:val="%8."/>
+      <w:lvlJc w:val="left"/>
+      <w:pPr>
+        <w:ind w:left="5760" w:hanging="360"/>
+      </w:pPr>
+    </w:lvl>
+    <w:lvl w:ilvl="8" w:tplc="0809001B" w:tentative="1">
+      <w:start w:val="1"/>
+      <w:numFmt w:val="lowerRoman"/>
+      <w:lvlText w:val="%9."/>
+      <w:lvlJc w:val="right"/>
+      <w:pPr>
+        <w:ind w:left="6480" w:hanging="180"/>
+      </w:pPr>
+    </w:lvl>
+  </w:abstractNum>
+  <w:abstractNum w:abstractNumId="16" w15:restartNumberingAfterBreak="0">
     <w:nsid w:val="3A934B39"/>
     <w:multiLevelType w:val="hybridMultilevel"/>
     <w:tmpl w:val="15B07FBC"/>
@@ -10183,7 +10237,7 @@
       </w:pPr>
     </w:lvl>
   </w:abstractNum>
-  <w:abstractNum w:abstractNumId="16" w15:restartNumberingAfterBreak="0">
+  <w:abstractNum w:abstractNumId="17" w15:restartNumberingAfterBreak="0">
     <w:nsid w:val="42447CAB"/>
     <w:multiLevelType w:val="hybridMultilevel"/>
     <w:tmpl w:val="1D2685E2"/>
@@ -10272,7 +10326,7 @@
       </w:pPr>
     </w:lvl>
   </w:abstractNum>
-  <w:abstractNum w:abstractNumId="17" w15:restartNumberingAfterBreak="0">
+  <w:abstractNum w:abstractNumId="18" w15:restartNumberingAfterBreak="0">
     <w:nsid w:val="42E34D9B"/>
     <w:multiLevelType w:val="hybridMultilevel"/>
     <w:tmpl w:val="F4BC7552"/>
@@ -10361,7 +10415,7 @@
       </w:pPr>
     </w:lvl>
   </w:abstractNum>
-  <w:abstractNum w:abstractNumId="18" w15:restartNumberingAfterBreak="0">
+  <w:abstractNum w:abstractNumId="19" w15:restartNumberingAfterBreak="0">
     <w:nsid w:val="44E2447E"/>
     <w:multiLevelType w:val="hybridMultilevel"/>
     <w:tmpl w:val="B290E53A"/>
@@ -10474,7 +10528,7 @@
       </w:rPr>
     </w:lvl>
   </w:abstractNum>
-  <w:abstractNum w:abstractNumId="19" w15:restartNumberingAfterBreak="0">
+  <w:abstractNum w:abstractNumId="20" w15:restartNumberingAfterBreak="0">
     <w:nsid w:val="47D279C7"/>
     <w:multiLevelType w:val="hybridMultilevel"/>
     <w:tmpl w:val="F684E67E"/>
@@ -10563,7 +10617,7 @@
       </w:pPr>
     </w:lvl>
   </w:abstractNum>
-  <w:abstractNum w:abstractNumId="20" w15:restartNumberingAfterBreak="0">
+  <w:abstractNum w:abstractNumId="21" w15:restartNumberingAfterBreak="0">
     <w:nsid w:val="5C92227C"/>
     <w:multiLevelType w:val="hybridMultilevel"/>
     <w:tmpl w:val="557E57FE"/>
@@ -10675,7 +10729,7 @@
       </w:rPr>
     </w:lvl>
   </w:abstractNum>
-  <w:abstractNum w:abstractNumId="21" w15:restartNumberingAfterBreak="0">
+  <w:abstractNum w:abstractNumId="22" w15:restartNumberingAfterBreak="0">
     <w:nsid w:val="649D2C19"/>
     <w:multiLevelType w:val="hybridMultilevel"/>
     <w:tmpl w:val="F2E01624"/>
@@ -10788,7 +10842,7 @@
       </w:rPr>
     </w:lvl>
   </w:abstractNum>
-  <w:abstractNum w:abstractNumId="22" w15:restartNumberingAfterBreak="0">
+  <w:abstractNum w:abstractNumId="23" w15:restartNumberingAfterBreak="0">
     <w:nsid w:val="6854278D"/>
     <w:multiLevelType w:val="hybridMultilevel"/>
     <w:tmpl w:val="AA62088E"/>
@@ -10877,7 +10931,7 @@
       </w:pPr>
     </w:lvl>
   </w:abstractNum>
-  <w:abstractNum w:abstractNumId="23" w15:restartNumberingAfterBreak="0">
+  <w:abstractNum w:abstractNumId="24" w15:restartNumberingAfterBreak="0">
     <w:nsid w:val="6AD41083"/>
     <w:multiLevelType w:val="hybridMultilevel"/>
     <w:tmpl w:val="4F68D04A"/>
@@ -10963,7 +11017,7 @@
       </w:pPr>
     </w:lvl>
   </w:abstractNum>
-  <w:abstractNum w:abstractNumId="24" w15:restartNumberingAfterBreak="0">
+  <w:abstractNum w:abstractNumId="25" w15:restartNumberingAfterBreak="0">
     <w:nsid w:val="6F9B684D"/>
     <w:multiLevelType w:val="hybridMultilevel"/>
     <w:tmpl w:val="2A962156"/>
@@ -11076,7 +11130,7 @@
       </w:rPr>
     </w:lvl>
   </w:abstractNum>
-  <w:abstractNum w:abstractNumId="25" w15:restartNumberingAfterBreak="0">
+  <w:abstractNum w:abstractNumId="26" w15:restartNumberingAfterBreak="0">
     <w:nsid w:val="77485005"/>
     <w:multiLevelType w:val="hybridMultilevel"/>
     <w:tmpl w:val="1D54A7B0"/>
@@ -11189,7 +11243,7 @@
       </w:rPr>
     </w:lvl>
   </w:abstractNum>
-  <w:abstractNum w:abstractNumId="26" w15:restartNumberingAfterBreak="0">
+  <w:abstractNum w:abstractNumId="27" w15:restartNumberingAfterBreak="0">
     <w:nsid w:val="77A26102"/>
     <w:multiLevelType w:val="hybridMultilevel"/>
     <w:tmpl w:val="A02892DE"/>
@@ -11275,7 +11329,7 @@
       </w:pPr>
     </w:lvl>
   </w:abstractNum>
-  <w:abstractNum w:abstractNumId="27" w15:restartNumberingAfterBreak="0">
+  <w:abstractNum w:abstractNumId="28" w15:restartNumberingAfterBreak="0">
     <w:nsid w:val="79E94091"/>
     <w:multiLevelType w:val="hybridMultilevel"/>
     <w:tmpl w:val="1D2685E2"/>
@@ -11374,19 +11428,19 @@
     <w:abstractNumId w:val="7"/>
   </w:num>
   <w:num w:numId="4" w16cid:durableId="1934240272">
-    <w:abstractNumId w:val="23"/>
+    <w:abstractNumId w:val="24"/>
   </w:num>
   <w:num w:numId="5" w16cid:durableId="500319591">
     <w:abstractNumId w:val="9"/>
   </w:num>
   <w:num w:numId="6" w16cid:durableId="1953244164">
-    <w:abstractNumId w:val="21"/>
+    <w:abstractNumId w:val="22"/>
   </w:num>
   <w:num w:numId="7" w16cid:durableId="1272973944">
     <w:abstractNumId w:val="4"/>
   </w:num>
   <w:num w:numId="8" w16cid:durableId="296837842">
-    <w:abstractNumId w:val="20"/>
+    <w:abstractNumId w:val="21"/>
   </w:num>
   <w:num w:numId="9" w16cid:durableId="1612740194">
     <w:abstractNumId w:val="6"/>
@@ -11398,7 +11452,7 @@
     <w:abstractNumId w:val="2"/>
   </w:num>
   <w:num w:numId="12" w16cid:durableId="57019460">
-    <w:abstractNumId w:val="15"/>
+    <w:abstractNumId w:val="16"/>
   </w:num>
   <w:num w:numId="13" w16cid:durableId="1135102731">
     <w:abstractNumId w:val="11"/>
@@ -11407,7 +11461,7 @@
     <w:abstractNumId w:val="12"/>
   </w:num>
   <w:num w:numId="15" w16cid:durableId="2078088890">
-    <w:abstractNumId w:val="17"/>
+    <w:abstractNumId w:val="18"/>
   </w:num>
   <w:num w:numId="16" w16cid:durableId="224148914">
     <w:abstractNumId w:val="1"/>
@@ -11416,37 +11470,40 @@
     <w:abstractNumId w:val="8"/>
   </w:num>
   <w:num w:numId="18" w16cid:durableId="1168524478">
-    <w:abstractNumId w:val="25"/>
+    <w:abstractNumId w:val="26"/>
   </w:num>
   <w:num w:numId="19" w16cid:durableId="1477914169">
-    <w:abstractNumId w:val="22"/>
+    <w:abstractNumId w:val="23"/>
   </w:num>
   <w:num w:numId="20" w16cid:durableId="1623457808">
     <w:abstractNumId w:val="10"/>
   </w:num>
   <w:num w:numId="21" w16cid:durableId="1264651575">
-    <w:abstractNumId w:val="16"/>
+    <w:abstractNumId w:val="17"/>
   </w:num>
   <w:num w:numId="22" w16cid:durableId="671879580">
-    <w:abstractNumId w:val="19"/>
+    <w:abstractNumId w:val="20"/>
   </w:num>
   <w:num w:numId="23" w16cid:durableId="850948606">
-    <w:abstractNumId w:val="27"/>
+    <w:abstractNumId w:val="28"/>
   </w:num>
   <w:num w:numId="24" w16cid:durableId="440616153">
     <w:abstractNumId w:val="0"/>
   </w:num>
   <w:num w:numId="25" w16cid:durableId="1892769113">
-    <w:abstractNumId w:val="24"/>
+    <w:abstractNumId w:val="25"/>
   </w:num>
   <w:num w:numId="26" w16cid:durableId="1310551058">
-    <w:abstractNumId w:val="18"/>
+    <w:abstractNumId w:val="19"/>
   </w:num>
   <w:num w:numId="27" w16cid:durableId="937251674">
-    <w:abstractNumId w:val="26"/>
+    <w:abstractNumId w:val="27"/>
   </w:num>
   <w:num w:numId="28" w16cid:durableId="951321994">
     <w:abstractNumId w:val="14"/>
+  </w:num>
+  <w:num w:numId="29" w16cid:durableId="962004609">
+    <w:abstractNumId w:val="15"/>
   </w:num>
 </w:numbering>
 </file>
@@ -18224,9 +18281,11 @@
     <w:rsid w:val="00344067"/>
     <w:rsid w:val="004912C7"/>
     <w:rsid w:val="00521A8B"/>
+    <w:rsid w:val="00575B8B"/>
     <w:rsid w:val="005805BD"/>
     <w:rsid w:val="005962A3"/>
     <w:rsid w:val="005B51A2"/>
+    <w:rsid w:val="005C043C"/>
     <w:rsid w:val="0066102B"/>
     <w:rsid w:val="00713B2F"/>
     <w:rsid w:val="007C1B1A"/>
@@ -19017,6 +19076,18 @@
 </file>
 
 <file path=customXml/item2.xml><?xml version="1.0" encoding="utf-8"?>
+<p:properties xmlns:p="http://schemas.microsoft.com/office/2006/metadata/properties" xmlns:xsi="http://www.w3.org/2001/XMLSchema-instance" xmlns:pc="http://schemas.microsoft.com/office/infopath/2007/PartnerControls">
+  <documentManagement>
+    <_activity xmlns="0858e797-1849-4dd5-9d5a-25e6beea22bc" xsi:nil="true"/>
+  </documentManagement>
+</p:properties>
+</file>
+
+<file path=customXml/item3.xml><?xml version="1.0" encoding="utf-8"?>
+<b:Sources xmlns:b="http://schemas.openxmlformats.org/officeDocument/2006/bibliography" xmlns="http://schemas.openxmlformats.org/officeDocument/2006/bibliography" SelectedStyle="\APASixthEditionOfficeOnline.xsl" StyleName="APA" Version="6"/>
+</file>
+
+<file path=customXml/item4.xml><?xml version="1.0" encoding="utf-8"?>
 <ct:contentTypeSchema xmlns:ct="http://schemas.microsoft.com/office/2006/metadata/contentType" xmlns:ma="http://schemas.microsoft.com/office/2006/metadata/properties/metaAttributes" ct:_="" ma:_="" ma:contentTypeName="Document" ma:contentTypeID="0x01010056C2B2184EA01F42B9D0C6F832942DBC" ma:contentTypeVersion="11" ma:contentTypeDescription="Create a new document." ma:contentTypeScope="" ma:versionID="55e0c6c1c4500967667bb16e4c70d9ff">
   <xsd:schema xmlns:xsd="http://www.w3.org/2001/XMLSchema" xmlns:xs="http://www.w3.org/2001/XMLSchema" xmlns:p="http://schemas.microsoft.com/office/2006/metadata/properties" xmlns:ns3="0858e797-1849-4dd5-9d5a-25e6beea22bc" targetNamespace="http://schemas.microsoft.com/office/2006/metadata/properties" ma:root="true" ma:fieldsID="db27273709eb546562b89a5719f57ae0" ns3:_="">
     <xsd:import namespace="0858e797-1849-4dd5-9d5a-25e6beea22bc"/>
@@ -19202,18 +19273,6 @@
 </ct:contentTypeSchema>
 </file>
 
-<file path=customXml/item3.xml><?xml version="1.0" encoding="utf-8"?>
-<b:Sources xmlns:b="http://schemas.openxmlformats.org/officeDocument/2006/bibliography" xmlns="http://schemas.openxmlformats.org/officeDocument/2006/bibliography" SelectedStyle="\APASixthEditionOfficeOnline.xsl" StyleName="APA" Version="6"/>
-</file>
-
-<file path=customXml/item4.xml><?xml version="1.0" encoding="utf-8"?>
-<p:properties xmlns:p="http://schemas.microsoft.com/office/2006/metadata/properties" xmlns:xsi="http://www.w3.org/2001/XMLSchema-instance" xmlns:pc="http://schemas.microsoft.com/office/infopath/2007/PartnerControls">
-  <documentManagement>
-    <_activity xmlns="0858e797-1849-4dd5-9d5a-25e6beea22bc" xsi:nil="true"/>
-  </documentManagement>
-</p:properties>
-</file>
-
 <file path=customXml/itemProps1.xml><?xml version="1.0" encoding="utf-8"?>
 <ds:datastoreItem xmlns:ds="http://schemas.openxmlformats.org/officeDocument/2006/customXml" ds:itemID="{21DAEC36-CEDD-4710-8B47-55AB3774ECF8}">
   <ds:schemaRefs>
@@ -19223,6 +19282,24 @@
 </file>
 
 <file path=customXml/itemProps2.xml><?xml version="1.0" encoding="utf-8"?>
+<ds:datastoreItem xmlns:ds="http://schemas.openxmlformats.org/officeDocument/2006/customXml" ds:itemID="{E89DA738-F8EF-4D0B-B780-2DD3CEB4BD99}">
+  <ds:schemaRefs>
+    <ds:schemaRef ds:uri="http://schemas.microsoft.com/office/2006/metadata/properties"/>
+    <ds:schemaRef ds:uri="http://schemas.microsoft.com/office/infopath/2007/PartnerControls"/>
+    <ds:schemaRef ds:uri="0858e797-1849-4dd5-9d5a-25e6beea22bc"/>
+  </ds:schemaRefs>
+</ds:datastoreItem>
+</file>
+
+<file path=customXml/itemProps3.xml><?xml version="1.0" encoding="utf-8"?>
+<ds:datastoreItem xmlns:ds="http://schemas.openxmlformats.org/officeDocument/2006/customXml" ds:itemID="{0D881E5E-1EED-4410-9E84-B313F13A8E11}">
+  <ds:schemaRefs>
+    <ds:schemaRef ds:uri="http://schemas.openxmlformats.org/officeDocument/2006/bibliography"/>
+  </ds:schemaRefs>
+</ds:datastoreItem>
+</file>
+
+<file path=customXml/itemProps4.xml><?xml version="1.0" encoding="utf-8"?>
 <ds:datastoreItem xmlns:ds="http://schemas.openxmlformats.org/officeDocument/2006/customXml" ds:itemID="{EC8C2B6D-BDDD-4B45-ACD4-AB782DE83F54}">
   <ds:schemaRefs>
     <ds:schemaRef ds:uri="http://schemas.microsoft.com/office/2006/metadata/contentType"/>
@@ -19238,28 +19315,4 @@
     <ds:schemaRef ds:uri="http://schemas.microsoft.com/internal/obd"/>
   </ds:schemaRefs>
 </ds:datastoreItem>
-</file>
-
-<file path=customXml/itemProps3.xml><?xml version="1.0" encoding="utf-8"?>
-<ds:datastoreItem xmlns:ds="http://schemas.openxmlformats.org/officeDocument/2006/customXml" ds:itemID="{0D881E5E-1EED-4410-9E84-B313F13A8E11}">
-  <ds:schemaRefs>
-    <ds:schemaRef ds:uri="http://schemas.openxmlformats.org/officeDocument/2006/bibliography"/>
-  </ds:schemaRefs>
-</ds:datastoreItem>
-</file>
-
-<file path=customXml/itemProps4.xml><?xml version="1.0" encoding="utf-8"?>
-<ds:datastoreItem xmlns:ds="http://schemas.openxmlformats.org/officeDocument/2006/customXml" ds:itemID="{E89DA738-F8EF-4D0B-B780-2DD3CEB4BD99}">
-  <ds:schemaRefs>
-    <ds:schemaRef ds:uri="http://purl.org/dc/terms/"/>
-    <ds:schemaRef ds:uri="http://purl.org/dc/elements/1.1/"/>
-    <ds:schemaRef ds:uri="http://purl.org/dc/dcmitype/"/>
-    <ds:schemaRef ds:uri="http://schemas.microsoft.com/office/infopath/2007/PartnerControls"/>
-    <ds:schemaRef ds:uri="http://schemas.microsoft.com/office/2006/metadata/properties"/>
-    <ds:schemaRef ds:uri="http://www.w3.org/XML/1998/namespace"/>
-    <ds:schemaRef ds:uri="http://schemas.microsoft.com/office/2006/documentManagement/types"/>
-    <ds:schemaRef ds:uri="http://schemas.openxmlformats.org/package/2006/metadata/core-properties"/>
-    <ds:schemaRef ds:uri="0858e797-1849-4dd5-9d5a-25e6beea22bc"/>
-  </ds:schemaRefs>
-</ds:datastoreItem>
 </file>
</xml_diff>